<commit_message>
Word layouts 3/4: the open layout for 4 Modern templates, EN + AR
Switches on the Open archetype: t1 6 12 22 - the name across the top, a
narrow unshaded column beside the main one.

- The rule between the columns is measured: drawn only where the PDF has
  one at the split (t1, t6, in their own grey); t12 has none and t22's
  line is its rail.
- A side column is never under 30% of the page: t22's 24.7% broke the
  email address mid-word. Stacked contact lines are 9pt.
- Tests that used modern-t1 as "the Modern master" now read every
  paragraph including table cells, expect the layout's measured headings,
  use t16 for the photo (t1's PDF has no photo slot), and count as a blank
  line only an empty paragraph over 4pt (a layout's 1-4pt structural
  paragraphs are required by Word).

Fast suite 3891 passed / 0 failed; real Word 8/8 open-layout files open
with clean page breaks.

Co-Authored-By: Claude Opus 5.5 <noreply@anthropic.com>
</commit_message>
<xml_diff>
--- a/word_masters/modern_gutter.docx
+++ b/word_masters/modern_gutter.docx
@@ -172,7 +172,7 @@
       </w:pPr>
       <w:r>
         <w:rPr>
-          <w:sz w:val="19"/>
+          <w:sz w:val="18"/>
         </w:rPr>
         <w:t>{{ c }}</w:t>
       </w:r>
@@ -1191,7 +1191,7 @@
             </w:pPr>
             <w:r>
               <w:rPr>
-                <w:sz w:val="19"/>
+                <w:sz w:val="18"/>
               </w:rPr>
               <w:t>{{ c }}</w:t>
             </w:r>

</xml_diff>